<commit_message>
Add Product Safety policy, align site content with intimacy/EU brand
- Add Product Safety and Responsible Use Policy page, link from policies index and footer
- Clean leftover electronics/UK content in en.json, seed data and checkout placeholders
- Make catalog price filters currency-aware; replace hardcoded £ bands with €
- Remove fabricated stats (98%/26 countries, 4.9 rating, 24h delivery) with policy-backed claims
- Strengthen checkout consent with 18+ confirmation and Returns policy link
- Ignore addons/.env.credentials to keep secrets out of git

Co-Authored-By: Claude Opus 4.7 <noreply@anthropic.com>
</commit_message>
<xml_diff>
--- a/data/ferutoys.com.docx
+++ b/data/ferutoys.com.docx
@@ -211,50 +211,29 @@
     <w:p>
       <w:pPr>
         <w:spacing w:after="0"/>
-        <w:rPr>
-          <w:lang w:val="en-US"/>
-        </w:rPr>
-      </w:pPr>
-      <w:r>
-        <w:rPr>
-          <w:lang w:val="en-US"/>
-        </w:rPr>
+      </w:pPr>
+      <w:r>
         <w:t>ferutoys.com</w:t>
       </w:r>
     </w:p>
     <w:p>
       <w:pPr>
         <w:spacing w:after="0"/>
-        <w:rPr>
-          <w:lang w:val="en-US"/>
-        </w:rPr>
-      </w:pPr>
-    </w:p>
-    <w:p>
-      <w:pPr>
-        <w:spacing w:after="0"/>
-        <w:rPr>
-          <w:lang w:val="en-US"/>
-        </w:rPr>
+      </w:pPr>
+    </w:p>
+    <w:p>
+      <w:pPr>
+        <w:spacing w:after="0"/>
       </w:pPr>
       <w:proofErr w:type="spellStart"/>
       <w:r>
-        <w:rPr>
-          <w:lang w:val="en-US"/>
-        </w:rPr>
         <w:t>Private</w:t>
       </w:r>
       <w:r>
-        <w:rPr>
-          <w:lang w:val="en-US"/>
-        </w:rPr>
         <w:t>email</w:t>
       </w:r>
       <w:proofErr w:type="spellEnd"/>
       <w:r>
-        <w:rPr>
-          <w:lang w:val="en-US"/>
-        </w:rPr>
         <w:br/>
       </w:r>
       <w:r>
@@ -264,31 +243,39 @@
         <w:t>@ferutoys.com</w:t>
       </w:r>
       <w:r>
-        <w:rPr>
-          <w:lang w:val="en-US"/>
-        </w:rPr>
         <w:br/>
-      </w:r>
-      <w:r>
-        <w:rPr>
-          <w:lang w:val="en-US"/>
-        </w:rPr>
-        <w:t>GfB26BPNzRMxuxZ4AQjD</w:t>
-      </w:r>
-      <w:r>
-        <w:rPr>
-          <w:lang w:val="en-US"/>
-        </w:rPr>
-        <w:t>!</w:t>
-      </w:r>
-    </w:p>
-    <w:p>
-      <w:pPr>
-        <w:spacing w:after="0"/>
-        <w:rPr>
-          <w:lang w:val="en-US"/>
-        </w:rPr>
-      </w:pPr>
+        <w:t>GfB26BPNzRMxuxZ4AQjD!</w:t>
+      </w:r>
+    </w:p>
+    <w:p>
+      <w:pPr>
+        <w:spacing w:after="0"/>
+      </w:pPr>
+    </w:p>
+    <w:p>
+      <w:pPr>
+        <w:spacing w:after="0"/>
+      </w:pPr>
+      <w:proofErr w:type="spellStart"/>
+      <w:r>
+        <w:t>Resend</w:t>
+      </w:r>
+      <w:proofErr w:type="spellEnd"/>
+    </w:p>
+    <w:p>
+      <w:pPr>
+        <w:spacing w:after="0"/>
+      </w:pPr>
+      <w:r>
+        <w:t>info</w:t>
+      </w:r>
+      <w:r>
+        <w:t>@ferutoys.com</w:t>
+      </w:r>
+      <w:r>
+        <w:br/>
+        <w:t>GfB26BPNzRMxuxZ4AQjD!</w:t>
+      </w:r>
     </w:p>
     <w:sectPr>
       <w:pgSz w:w="11906" w:h="16838"/>
@@ -903,6 +890,7 @@
   <w:style w:type="character" w:default="1" w:styleId="DefaultParagraphFont">
     <w:name w:val="Default Paragraph Font"/>
     <w:uiPriority w:val="1"/>
+    <w:semiHidden/>
     <w:unhideWhenUsed/>
   </w:style>
   <w:style w:type="table" w:default="1" w:styleId="TableNormal">
@@ -1237,6 +1225,18 @@
     <w:rPr>
       <w:color w:val="605E5C"/>
       <w:shd w:val="clear" w:color="auto" w:fill="E1DFDD"/>
+    </w:rPr>
+  </w:style>
+  <w:style w:type="character" w:styleId="FollowedHyperlink">
+    <w:name w:val="FollowedHyperlink"/>
+    <w:basedOn w:val="DefaultParagraphFont"/>
+    <w:uiPriority w:val="99"/>
+    <w:semiHidden/>
+    <w:unhideWhenUsed/>
+    <w:rsid w:val="00754C58"/>
+    <w:rPr>
+      <w:color w:val="96607D" w:themeColor="followedHyperlink"/>
+      <w:u w:val="single"/>
     </w:rPr>
   </w:style>
 </w:styles>

</xml_diff>